<commit_message>
Replace Aim 1 calibration system with known-ground-truth ladder
Drop the 3D co-culture as the calibration system. Aim 1 now uses a
planar bilayer phantom for geometric calibration, mixed pellets with an
orthogonal sortase or synNotch contact reporter for per-cell sensitivity
and specificity, and anatomically obligate contacts in native tissue,
with a separately-fixed-then-combined control throughout.

Co-Authored-By: Claude Opus 5.5 <noreply@anthropic.com>
Claude-Session: https://claude.ai/code/session_016iYNRvycXrAsZAWm2v4tzv
</commit_message>
<xml_diff>
--- a/Nilsson_postdoc_proposal_Josyula.docx
+++ b/Nilsson_postdoc_proposal_Josyula.docx
@@ -167,12 +167,44 @@
           <w:i/>
           <w:sz w:val="21"/>
         </w:rPr>
-        <w:t>Aim 1. Establish and calibrate the contact readout where the answer is already known (year 1)</w:t>
+        <w:t>Aim 1. Calibrate the contact readout against known ground truth (year 1)</w:t>
       </w:r>
     </w:p>
     <w:p>
       <w:r>
-        <w:t>The 3D macrophage-neuron-islet co-culture I built and published during my PhD (Muntjewerff, Josyula &amp; Christoffersson, Bio-Protocol 2023, https://doi.org/10.21769/BioProtoc.4852) is the right place to start, because contact can be imaged directly before the section is processed. That gives per-cell ground truth, so sensitivity and false-positive rate are measured rather than assumed. Deliverables: the detection efficiency of contact-gated circularisation, the effective distance threshold as a function of splint length, and confirmation that a contact round and a sequencing round can be run on one section without either compromising the other.</w:t>
+        <w:t>Calibration requires certainty about which cells touched, not physiological realism. A co-culture supplies neither: contact status is inferred from the same imaging the assay is meant to replace. So Aim 1 uses three systems in which the answer is known independently of the assay, in ascending order of realism.</w:t>
+      </w:r>
+    </w:p>
+    <w:p>
+      <w:pPr>
+        <w:pStyle w:val="ListBullet"/>
+        <w:spacing w:after="60"/>
+      </w:pPr>
+      <w:r>
+        <w:t>Planar bilayer phantom. Two cell populations carrying distinct surface epitopes are fixed as separate slabs and apposed, so every genuine interface lies in one known plane. Signal as a function of distance from that plane gives the distance-response function and the background rate directly, from geometry rather than from inference. This alone sets the effective threshold as a function of splint length.</w:t>
+      </w:r>
+    </w:p>
+    <w:p>
+      <w:pPr>
+        <w:pStyle w:val="ListBullet"/>
+        <w:spacing w:after="60"/>
+      </w:pPr>
+      <w:r>
+        <w:t>Mixed pellets with an orthogonal genetic contact reporter. Two populations are mixed, embedded and sectioned, with contact history recorded independently by sortase-mediated transfer between apposed cells, the labelling principle behind LIPSTIC (Pasqual et al., Nature 2018, https://doi.org/10.1038/nature25442; applied at scale in Canesso et al., Science 2025, https://doi.org/10.1126/science.ado5088), or by a contact-dependent synNotch reporter (Roybal et al., Cell 2016, https://doi.org/10.1016/j.cell.2016.09.011; Toda et al., Science 2018, https://doi.org/10.1126/science.aat0271). Because the reporter and the padlock readout are mechanistically unrelated, agreement between them is real evidence rather than circular. This yields per-cell sensitivity and specificity as numbers, and mixing ratio tunes contact frequency across the range the tissue work will meet.</w:t>
+      </w:r>
+    </w:p>
+    <w:p>
+      <w:pPr>
+        <w:pStyle w:val="ListBullet"/>
+        <w:spacing w:after="60"/>
+      </w:pPr>
+      <w:r>
+        <w:t>Anatomically obligate contact in native tissue. Peripheral nerve, where Schwann cell and axon apposition is guaranteed by anatomy, and the neuromuscular junction, where the contacting partners are unambiguous. These confirm the chemistry survives fixed, archival tissue rather than only cell pellets, which is the step at which many in situ assays quietly fail.</w:t>
+      </w:r>
+    </w:p>
+    <w:p>
+      <w:r>
+        <w:t>One control runs through all three: populations fixed separately and only then combined. Those cells are physically apposed but never interacted in life, so any signal they generate is artefact by construction. It separates apposition from true contact, which is the failure mode most likely to produce a convincing but wrong result. Deliverables: detection efficiency, false-positive rate, the calibrated distance threshold, and confirmation that a contact round and a sequencing round run on one section without either degrading the other.</w:t>
       </w:r>
     </w:p>
     <w:p>
@@ -537,7 +569,7 @@
         <w:spacing w:after="60"/>
       </w:pPr>
       <w:r>
-        <w:t>The validation layer. Confocal, live-cell, intravital and live pancreatic tissue slice imaging with quantification in IMARIS and ImageJ. A spatial claim validated only against transcriptomic data is validated circularly; imaging breaks the circle, and Aim 1 depends on it entirely.</w:t>
+        <w:t>The validation layer. Confocal, live-cell, intravital and live pancreatic tissue slice imaging with quantification in IMARIS and ImageJ. A spatial claim validated only against transcriptomic data is validated circularly; independent imaging breaks the circle.</w:t>
       </w:r>
     </w:p>
     <w:p>
@@ -546,7 +578,7 @@
         <w:spacing w:after="60"/>
       </w:pPr>
       <w:r>
-        <w:t>A published 3D neuron-macrophage-islet system, which is the controllable test bed the first year needs.</w:t>
+        <w:t>Live pancreatic tissue slice imaging, which I established at Uppsala, and which is what makes the temporal arm of Aim 2 possible in tissue rather than in a dish.</w:t>
       </w:r>
     </w:p>
     <w:p>

</xml_diff>